<commit_message>
Atualiza fluxos de termo, ordem de servico e cadastros
</commit_message>
<xml_diff>
--- a/documento/Termo de Adesão - PF.docx
+++ b/documento/Termo de Adesão - PF.docx
@@ -14,6 +14,16 @@
     </w:p>
     <w:p>
       <w:pPr>
+        <w:rPr>
+          <w:rFonts w:ascii="Tahoma" w:eastAsia="Arial Unicode MS" w:hAnsi="Tahoma" w:cs="Tahoma"/>
+          <w:b/>
+          <w:sz w:val="16"/>
+          <w:szCs w:val="16"/>
+        </w:rPr>
+      </w:pPr>
+    </w:p>
+    <w:p>
+      <w:pPr>
         <w:jc w:val="center"/>
         <w:rPr>
           <w:rFonts w:ascii="Tahoma" w:eastAsia="Arial Unicode MS" w:hAnsi="Tahoma" w:cs="Tahoma"/>
@@ -29,8 +39,9 @@
           <w:sz w:val="16"/>
           <w:szCs w:val="16"/>
         </w:rPr>
-        <w:t>TERMO DE ADESÃO AO CREDENCIAMENTO</w:t>
-      </w:r>
+        <w:t xml:space="preserve">TERMO DE ADESÃO AO CREDENCIAMENTO Nº &lt;termo/termo de </w:t>
+      </w:r>
+      <w:proofErr w:type="spellStart"/>
       <w:r>
         <w:rPr>
           <w:rFonts w:ascii="Tahoma" w:eastAsia="Arial Unicode MS" w:hAnsi="Tahoma" w:cs="Tahoma"/>
@@ -38,8 +49,9 @@
           <w:sz w:val="16"/>
           <w:szCs w:val="16"/>
         </w:rPr>
-        <w:t xml:space="preserve"> Nº </w:t>
-      </w:r>
+        <w:t>adesao</w:t>
+      </w:r>
+      <w:proofErr w:type="spellEnd"/>
       <w:r>
         <w:rPr>
           <w:rFonts w:ascii="Tahoma" w:eastAsia="Arial Unicode MS" w:hAnsi="Tahoma" w:cs="Tahoma"/>
@@ -47,210 +59,162 @@
           <w:sz w:val="16"/>
           <w:szCs w:val="16"/>
         </w:rPr>
+        <w:t>&gt;</w:t>
+      </w:r>
+    </w:p>
+    <w:p>
+      <w:pPr>
+        <w:jc w:val="both"/>
+        <w:rPr>
+          <w:rFonts w:ascii="Tahoma" w:eastAsia="Arial Unicode MS" w:hAnsi="Tahoma" w:cs="Tahoma"/>
+          <w:sz w:val="16"/>
+          <w:szCs w:val="16"/>
+        </w:rPr>
+      </w:pPr>
+    </w:p>
+    <w:p>
+      <w:pPr>
+        <w:jc w:val="both"/>
+        <w:rPr>
+          <w:rFonts w:ascii="Tahoma" w:eastAsia="Arial Unicode MS" w:hAnsi="Tahoma" w:cs="Tahoma"/>
+          <w:sz w:val="16"/>
+          <w:szCs w:val="16"/>
+        </w:rPr>
+      </w:pPr>
+    </w:p>
+    <w:p>
+      <w:pPr>
+        <w:ind w:right="60"/>
+        <w:jc w:val="both"/>
+        <w:rPr>
+          <w:rFonts w:ascii="Tahoma" w:eastAsia="Arial Unicode MS" w:hAnsi="Tahoma" w:cs="Tahoma"/>
+          <w:b/>
+          <w:sz w:val="16"/>
+          <w:szCs w:val="16"/>
+        </w:rPr>
+      </w:pPr>
+      <w:r>
+        <w:rPr>
+          <w:rFonts w:ascii="Tahoma" w:eastAsia="Arial Unicode MS" w:hAnsi="Tahoma" w:cs="Tahoma"/>
+          <w:b/>
+          <w:sz w:val="16"/>
+          <w:szCs w:val="16"/>
+        </w:rPr>
+        <w:t>CREDENCIANTE</w:t>
+      </w:r>
+      <w:r>
+        <w:rPr>
+          <w:rFonts w:ascii="Tahoma" w:eastAsia="Arial Unicode MS" w:hAnsi="Tahoma" w:cs="Tahoma"/>
+          <w:sz w:val="16"/>
+          <w:szCs w:val="16"/>
+        </w:rPr>
+        <w:t>:</w:t>
+      </w:r>
+      <w:r>
+        <w:rPr>
+          <w:rFonts w:ascii="Tahoma" w:eastAsia="Arial Unicode MS" w:hAnsi="Tahoma" w:cs="Tahoma"/>
+          <w:b/>
+          <w:sz w:val="16"/>
+          <w:szCs w:val="16"/>
+        </w:rPr>
+        <w:t xml:space="preserve"> PREFEITURA DO MUNICÍPIO DE SÃO PAULO, por meio do Departamento de Transportes Públicos - DTP da Secretaria Municipal de Mobilidade Urbana e Transporte – SMT.</w:t>
+      </w:r>
+    </w:p>
+    <w:p>
+      <w:pPr>
+        <w:jc w:val="both"/>
+        <w:rPr>
+          <w:rFonts w:ascii="Tahoma" w:eastAsia="Arial Unicode MS" w:hAnsi="Tahoma" w:cs="Tahoma"/>
+          <w:sz w:val="16"/>
+          <w:szCs w:val="16"/>
+        </w:rPr>
+      </w:pPr>
+    </w:p>
+    <w:p>
+      <w:pPr>
+        <w:jc w:val="both"/>
+        <w:rPr>
+          <w:rFonts w:ascii="Tahoma" w:eastAsia="Arial Unicode MS" w:hAnsi="Tahoma" w:cs="Tahoma"/>
+          <w:sz w:val="16"/>
+          <w:szCs w:val="16"/>
+        </w:rPr>
+      </w:pPr>
+    </w:p>
+    <w:p>
+      <w:pPr>
+        <w:jc w:val="both"/>
+        <w:rPr>
+          <w:rFonts w:ascii="Tahoma" w:eastAsia="Arial Unicode MS" w:hAnsi="Tahoma" w:cs="Tahoma"/>
+          <w:sz w:val="16"/>
+          <w:szCs w:val="16"/>
+        </w:rPr>
+      </w:pPr>
+      <w:r>
+        <w:rPr>
+          <w:rFonts w:ascii="Tahoma" w:eastAsia="Arial Unicode MS" w:hAnsi="Tahoma" w:cs="Tahoma"/>
+          <w:b/>
+          <w:sz w:val="16"/>
+          <w:szCs w:val="16"/>
+        </w:rPr>
+        <w:t xml:space="preserve">CREDENCIADO: </w:t>
+      </w:r>
+      <w:r>
+        <w:rPr>
+          <w:rFonts w:ascii="Tahoma" w:eastAsia="Arial Unicode MS" w:hAnsi="Tahoma" w:cs="Tahoma"/>
+          <w:color w:val="000000" w:themeColor="text1"/>
+          <w:sz w:val="16"/>
+          <w:szCs w:val="16"/>
+        </w:rPr>
         <w:fldChar w:fldCharType="begin"/>
       </w:r>
       <w:r>
         <w:rPr>
           <w:rFonts w:ascii="Tahoma" w:eastAsia="Arial Unicode MS" w:hAnsi="Tahoma" w:cs="Tahoma"/>
+          <w:color w:val="000000" w:themeColor="text1"/>
+          <w:sz w:val="16"/>
+          <w:szCs w:val="16"/>
+        </w:rPr>
+        <w:instrText xml:space="preserve"> MERGEFIELD Credenciado </w:instrText>
+      </w:r>
+      <w:r>
+        <w:rPr>
+          <w:rFonts w:ascii="Tahoma" w:eastAsia="Arial Unicode MS" w:hAnsi="Tahoma" w:cs="Tahoma"/>
+          <w:color w:val="000000" w:themeColor="text1"/>
+          <w:sz w:val="16"/>
+          <w:szCs w:val="16"/>
+        </w:rPr>
+        <w:fldChar w:fldCharType="separate"/>
+      </w:r>
+      <w:r>
+        <w:rPr>
+          <w:rFonts w:ascii="Tahoma" w:eastAsia="Arial Unicode MS" w:hAnsi="Tahoma" w:cs="Tahoma"/>
+          <w:noProof/>
+          <w:color w:val="000000" w:themeColor="text1"/>
+          <w:sz w:val="16"/>
+          <w:szCs w:val="16"/>
+        </w:rPr>
+        <w:t>&lt;termo/credenciado&gt;</w:t>
+      </w:r>
+      <w:r>
+        <w:rPr>
+          <w:rFonts w:ascii="Tahoma" w:eastAsia="Arial Unicode MS" w:hAnsi="Tahoma" w:cs="Tahoma"/>
+          <w:color w:val="000000" w:themeColor="text1"/>
+          <w:sz w:val="16"/>
+          <w:szCs w:val="16"/>
+        </w:rPr>
+        <w:fldChar w:fldCharType="end"/>
+      </w:r>
+    </w:p>
+    <w:p>
+      <w:pPr>
+        <w:jc w:val="center"/>
+        <w:rPr>
+          <w:rFonts w:ascii="Tahoma" w:eastAsia="Arial Unicode MS" w:hAnsi="Tahoma" w:cs="Tahoma"/>
           <w:b/>
           <w:sz w:val="16"/>
           <w:szCs w:val="16"/>
         </w:rPr>
-        <w:instrText xml:space="preserve"> MERGEFIELD Termo_de_adesao </w:instrText>
-      </w:r>
-      <w:r>
-        <w:rPr>
-          <w:rFonts w:ascii="Tahoma" w:eastAsia="Arial Unicode MS" w:hAnsi="Tahoma" w:cs="Tahoma"/>
-          <w:b/>
-          <w:sz w:val="16"/>
-          <w:szCs w:val="16"/>
-        </w:rPr>
-        <w:fldChar w:fldCharType="separate"/>
-      </w:r>
-      <w:r>
-        <w:rPr>
-          <w:rFonts w:ascii="Tahoma" w:eastAsia="Arial Unicode MS" w:hAnsi="Tahoma" w:cs="Tahoma"/>
-          <w:b/>
-          <w:noProof/>
-          <w:sz w:val="16"/>
-          <w:szCs w:val="16"/>
-        </w:rPr>
-        <w:t>2024/0012218</w:t>
-      </w:r>
-      <w:r>
-        <w:rPr>
-          <w:rFonts w:ascii="Tahoma" w:eastAsia="Arial Unicode MS" w:hAnsi="Tahoma" w:cs="Tahoma"/>
-          <w:b/>
-          <w:sz w:val="16"/>
-          <w:szCs w:val="16"/>
-        </w:rPr>
-        <w:fldChar w:fldCharType="end"/>
-      </w:r>
-    </w:p>
-    <w:p>
-      <w:pPr>
-        <w:jc w:val="both"/>
-        <w:rPr>
-          <w:rFonts w:ascii="Tahoma" w:eastAsia="Arial Unicode MS" w:hAnsi="Tahoma" w:cs="Tahoma"/>
-          <w:sz w:val="16"/>
-          <w:szCs w:val="16"/>
-        </w:rPr>
-      </w:pPr>
-    </w:p>
-    <w:p>
-      <w:pPr>
-        <w:jc w:val="both"/>
-        <w:rPr>
-          <w:rFonts w:ascii="Tahoma" w:eastAsia="Arial Unicode MS" w:hAnsi="Tahoma" w:cs="Tahoma"/>
-          <w:sz w:val="16"/>
-          <w:szCs w:val="16"/>
-        </w:rPr>
-      </w:pPr>
-    </w:p>
-    <w:p>
-      <w:pPr>
-        <w:ind w:right="60"/>
-        <w:jc w:val="both"/>
-        <w:rPr>
-          <w:rFonts w:ascii="Tahoma" w:eastAsia="Arial Unicode MS" w:hAnsi="Tahoma" w:cs="Tahoma"/>
-          <w:b/>
-          <w:sz w:val="16"/>
-          <w:szCs w:val="16"/>
-        </w:rPr>
-      </w:pPr>
-      <w:r>
-        <w:rPr>
-          <w:rFonts w:ascii="Tahoma" w:eastAsia="Arial Unicode MS" w:hAnsi="Tahoma" w:cs="Tahoma"/>
-          <w:b/>
-          <w:sz w:val="16"/>
-          <w:szCs w:val="16"/>
-        </w:rPr>
-        <w:t>CREDENCIANTE</w:t>
-      </w:r>
-      <w:r>
-        <w:rPr>
-          <w:rFonts w:ascii="Tahoma" w:eastAsia="Arial Unicode MS" w:hAnsi="Tahoma" w:cs="Tahoma"/>
-          <w:sz w:val="16"/>
-          <w:szCs w:val="16"/>
-        </w:rPr>
-        <w:t>:</w:t>
-      </w:r>
-      <w:r>
-        <w:rPr>
-          <w:rFonts w:ascii="Tahoma" w:eastAsia="Arial Unicode MS" w:hAnsi="Tahoma" w:cs="Tahoma"/>
-          <w:b/>
-          <w:sz w:val="16"/>
-          <w:szCs w:val="16"/>
-        </w:rPr>
-        <w:t xml:space="preserve"> PREFEITURA DO MUNICÍPIO DE SÃO PAULO, por meio do Departamento de Transportes Públicos - DTP da Secretaria Municipal de Mobilidade </w:t>
-      </w:r>
-      <w:r>
-        <w:rPr>
-          <w:rFonts w:ascii="Tahoma" w:eastAsia="Arial Unicode MS" w:hAnsi="Tahoma" w:cs="Tahoma"/>
-          <w:b/>
-          <w:sz w:val="16"/>
-          <w:szCs w:val="16"/>
-        </w:rPr>
-        <w:t>Urbana e Transporte</w:t>
-      </w:r>
-      <w:r>
-        <w:rPr>
-          <w:rFonts w:ascii="Tahoma" w:eastAsia="Arial Unicode MS" w:hAnsi="Tahoma" w:cs="Tahoma"/>
-          <w:b/>
-          <w:sz w:val="16"/>
-          <w:szCs w:val="16"/>
-        </w:rPr>
-        <w:t xml:space="preserve"> – SMT.</w:t>
-      </w:r>
-    </w:p>
-    <w:p>
-      <w:pPr>
-        <w:jc w:val="both"/>
-        <w:rPr>
-          <w:rFonts w:ascii="Tahoma" w:eastAsia="Arial Unicode MS" w:hAnsi="Tahoma" w:cs="Tahoma"/>
-          <w:sz w:val="16"/>
-          <w:szCs w:val="16"/>
-        </w:rPr>
-      </w:pPr>
-    </w:p>
-    <w:p>
-      <w:pPr>
-        <w:jc w:val="both"/>
-        <w:rPr>
-          <w:rFonts w:ascii="Tahoma" w:eastAsia="Arial Unicode MS" w:hAnsi="Tahoma" w:cs="Tahoma"/>
-          <w:sz w:val="16"/>
-          <w:szCs w:val="16"/>
-        </w:rPr>
-      </w:pPr>
-    </w:p>
-    <w:p>
-      <w:pPr>
-        <w:jc w:val="both"/>
-        <w:rPr>
-          <w:rFonts w:ascii="Tahoma" w:eastAsia="Arial Unicode MS" w:hAnsi="Tahoma" w:cs="Tahoma"/>
-          <w:sz w:val="16"/>
-          <w:szCs w:val="16"/>
-        </w:rPr>
-      </w:pPr>
-      <w:r>
-        <w:rPr>
-          <w:rFonts w:ascii="Tahoma" w:eastAsia="Arial Unicode MS" w:hAnsi="Tahoma" w:cs="Tahoma"/>
-          <w:b/>
-          <w:sz w:val="16"/>
-          <w:szCs w:val="16"/>
-        </w:rPr>
-        <w:t>CREDENCIADO:</w:t>
-      </w:r>
-      <w:r>
-        <w:rPr>
-          <w:rFonts w:ascii="Tahoma" w:eastAsia="Arial Unicode MS" w:hAnsi="Tahoma" w:cs="Tahoma"/>
-          <w:b/>
-          <w:sz w:val="16"/>
-          <w:szCs w:val="16"/>
-        </w:rPr>
-        <w:t xml:space="preserve"> </w:t>
-      </w:r>
-      <w:r>
-        <w:rPr>
-          <w:rFonts w:ascii="Tahoma" w:eastAsia="Arial Unicode MS" w:hAnsi="Tahoma" w:cs="Tahoma"/>
-          <w:sz w:val="16"/>
-          <w:szCs w:val="16"/>
-        </w:rPr>
-        <w:fldChar w:fldCharType="begin"/>
-      </w:r>
-      <w:r>
-        <w:rPr>
-          <w:rFonts w:ascii="Tahoma" w:eastAsia="Arial Unicode MS" w:hAnsi="Tahoma" w:cs="Tahoma"/>
-          <w:sz w:val="16"/>
-          <w:szCs w:val="16"/>
-        </w:rPr>
-        <w:instrText xml:space="preserve"> MERGEFIELD Credenciado </w:instrText>
-      </w:r>
-      <w:r>
-        <w:rPr>
-          <w:rFonts w:ascii="Tahoma" w:eastAsia="Arial Unicode MS" w:hAnsi="Tahoma" w:cs="Tahoma"/>
-          <w:sz w:val="16"/>
-          <w:szCs w:val="16"/>
-        </w:rPr>
-        <w:fldChar w:fldCharType="separate"/>
-      </w:r>
-      <w:r>
-        <w:rPr>
-          <w:rFonts w:ascii="Tahoma" w:eastAsia="Arial Unicode MS" w:hAnsi="Tahoma" w:cs="Tahoma"/>
-          <w:noProof/>
-          <w:sz w:val="16"/>
-          <w:szCs w:val="16"/>
-        </w:rPr>
-        <w:t>AILTON HONORATO DE SOUSA</w:t>
-      </w:r>
-      <w:r>
-        <w:rPr>
-          <w:rFonts w:ascii="Tahoma" w:eastAsia="Arial Unicode MS" w:hAnsi="Tahoma" w:cs="Tahoma"/>
-          <w:sz w:val="16"/>
-          <w:szCs w:val="16"/>
-        </w:rPr>
-        <w:fldChar w:fldCharType="end"/>
-      </w:r>
+      </w:pPr>
     </w:p>
     <w:p>
       <w:pPr>
@@ -1389,6 +1353,7 @@
           <w:sz w:val="16"/>
           <w:szCs w:val="16"/>
         </w:rPr>
+        <w:lastRenderedPageBreak/>
         <w:t>1.6.</w:t>
       </w:r>
       <w:r>
@@ -1430,7 +1395,6 @@
           <w:sz w:val="16"/>
           <w:szCs w:val="16"/>
         </w:rPr>
-        <w:lastRenderedPageBreak/>
         <w:t>1.7.</w:t>
       </w:r>
       <w:r>
@@ -2357,6 +2321,7 @@
           <w:sz w:val="16"/>
           <w:szCs w:val="16"/>
         </w:rPr>
+        <w:lastRenderedPageBreak/>
         <w:t>5.1.</w:t>
       </w:r>
       <w:r>
@@ -2412,7 +2377,6 @@
           <w:sz w:val="16"/>
           <w:szCs w:val="16"/>
         </w:rPr>
-        <w:lastRenderedPageBreak/>
         <w:tab/>
         <w:t>5.1.1. A remuneração fixa, prevista no Anexo I, somente será paga àqueles que atingirem o mínimo da demanda constante nas tabelas.</w:t>
       </w:r>
@@ -3220,7 +3184,16 @@
           <w:sz w:val="16"/>
           <w:szCs w:val="16"/>
         </w:rPr>
-        <w:t xml:space="preserve"> o educando/criança perca o direito ao transporte em dia que não seja o último dia do mês, o pagamento será proporcional.</w:t>
+        <w:t xml:space="preserve"> o </w:t>
+      </w:r>
+      <w:r>
+        <w:rPr>
+          <w:rFonts w:ascii="Tahoma" w:eastAsia="Arial Unicode MS" w:hAnsi="Tahoma" w:cs="Tahoma"/>
+          <w:sz w:val="16"/>
+          <w:szCs w:val="16"/>
+        </w:rPr>
+        <w:lastRenderedPageBreak/>
+        <w:t>educando/criança perca o direito ao transporte em dia que não seja o último dia do mês, o pagamento será proporcional.</w:t>
       </w:r>
     </w:p>
     <w:p>
@@ -3252,7 +3225,6 @@
           <w:sz w:val="16"/>
           <w:szCs w:val="16"/>
         </w:rPr>
-        <w:lastRenderedPageBreak/>
         <w:t>5.7.</w:t>
       </w:r>
       <w:r>
@@ -6019,7 +5991,16 @@
           <w:sz w:val="16"/>
           <w:szCs w:val="16"/>
         </w:rPr>
-        <w:t xml:space="preserve"> a efetuar o transporte de parte da demanda assumida, após confirmada a demanda pela DRE e emitida a respectiva Ordem de Serviço pelo DTP, podendo a CREDENCIANTE rescindir o presente Termo.</w:t>
+        <w:t xml:space="preserve"> a efetuar o transporte de parte da demanda assumida, após confirmada a demanda pela DRE e </w:t>
+      </w:r>
+      <w:r>
+        <w:rPr>
+          <w:rFonts w:ascii="Tahoma" w:eastAsia="Arial Unicode MS" w:hAnsi="Tahoma" w:cs="Tahoma"/>
+          <w:sz w:val="16"/>
+          <w:szCs w:val="16"/>
+        </w:rPr>
+        <w:lastRenderedPageBreak/>
+        <w:t>emitida a respectiva Ordem de Serviço pelo DTP, podendo a CREDENCIANTE rescindir o presente Termo.</w:t>
       </w:r>
     </w:p>
     <w:p>
@@ -6049,7 +6030,6 @@
           <w:sz w:val="16"/>
           <w:szCs w:val="16"/>
         </w:rPr>
-        <w:lastRenderedPageBreak/>
         <w:t>8.2.8.</w:t>
       </w:r>
       <w:r>
@@ -9477,6 +9457,7 @@
                 <w:sz w:val="16"/>
                 <w:szCs w:val="16"/>
               </w:rPr>
+              <w:lastRenderedPageBreak/>
               <w:t>2 alunos</w:t>
             </w:r>
           </w:p>

</xml_diff>